<commit_message>
style: update CV document template and regenerate CV docx
Co-Authored-By: Claude <noreply@anthropic.com>
</commit_message>
<xml_diff>
--- a/data/ko/HyeonseungKang-CV.docx
+++ b/data/ko/HyeonseungKang-CV.docx
@@ -1,6 +1,6 @@
 
 <file path=word/document.xml><?xml version="1.0" encoding="utf-8"?>
-<w:document xmlns:wpc="http://schemas.microsoft.com/office/word/2010/wordprocessingCanvas" xmlns:cx="http://schemas.microsoft.com/office/drawing/2014/chartex" xmlns:cx1="http://schemas.microsoft.com/office/drawing/2015/9/8/chartex" xmlns:cx2="http://schemas.microsoft.com/office/drawing/2015/10/21/chartex" xmlns:cx3="http://schemas.microsoft.com/office/drawing/2016/5/9/chartex" xmlns:cx4="http://schemas.microsoft.com/office/drawing/2016/5/10/chartex" xmlns:cx5="http://schemas.microsoft.com/office/drawing/2016/5/11/chartex" xmlns:cx6="http://schemas.microsoft.com/office/drawing/2016/5/12/chartex" xmlns:cx7="http://schemas.microsoft.com/office/drawing/2016/5/13/chartex" xmlns:cx8="http://schemas.microsoft.com/office/drawing/2016/5/14/chartex" xmlns:mc="http://schemas.openxmlformats.org/markup-compatibility/2006" xmlns:m="http://schemas.openxmlformats.org/officeDocument/2006/math" xmlns:aink="http://schemas.microsoft.com/office/drawing/2016/ink" xmlns:am3d="http://schemas.microsoft.com/office/drawing/2017/model3d" xmlns:oel="http://schemas.microsoft.com/office/2019/extlst" xmlns:r="http://schemas.openxmlformats.org/officeDocument/2006/relationships" xmlns:wp14="http://schemas.microsoft.com/office/word/2010/wordprocessingDrawing" xmlns:wp="http://schemas.openxmlformats.org/drawingml/2006/wordprocessingDrawing" xmlns:wpg="http://schemas.microsoft.com/office/word/2010/wordprocessingGroup" xmlns:wpi="http://schemas.microsoft.com/office/word/2010/wordprocessingInk" xmlns:wps="http://schemas.microsoft.com/office/word/2010/wordprocessingShape" xmlns:o="urn:schemas-microsoft-com:office:office" xmlns:v="urn:schemas-microsoft-com:vml" xmlns:w10="urn:schemas-microsoft-com:office:word" xmlns:w="http://schemas.openxmlformats.org/wordprocessingml/2006/main" xmlns:w14="http://schemas.microsoft.com/office/word/2010/wordml" xmlns:w15="http://schemas.microsoft.com/office/word/2012/wordml" xmlns:w16cei="http://schemas.microsoft.com/office/word/2026/wordml/cei" xmlns:w16cex="http://schemas.microsoft.com/office/word/2018/wordml/cex" xmlns:w16cid="http://schemas.microsoft.com/office/word/2016/wordml/cid" xmlns:w16="http://schemas.microsoft.com/office/word/2018/wordml" xmlns:w16sdtdh="http://schemas.microsoft.com/office/word/2020/wordml/sdtdatahash" xmlns:w16sdtfl="http://schemas.microsoft.com/office/word/2024/wordml/sdtformatlock" xmlns:w16se="http://schemas.microsoft.com/office/word/2015/wordml/symex" xmlns:w16du="http://schemas.microsoft.com/office/word/2023/wordml/word16du" xmlns:wne="http://schemas.microsoft.com/office/word/2006/wordml" mc:Ignorable="w14 w15 w16se w16cid w16 w16cex w16sdtdh w16sdtfl w16du wp14">
+<w:document xmlns:wpc="http://schemas.microsoft.com/office/word/2010/wordprocessingCanvas" xmlns:cx="http://schemas.microsoft.com/office/drawing/2014/chartex" xmlns:cx1="http://schemas.microsoft.com/office/drawing/2015/9/8/chartex" xmlns:cx2="http://schemas.microsoft.com/office/drawing/2015/10/21/chartex" xmlns:cx3="http://schemas.microsoft.com/office/drawing/2016/5/9/chartex" xmlns:cx4="http://schemas.microsoft.com/office/drawing/2016/5/10/chartex" xmlns:cx5="http://schemas.microsoft.com/office/drawing/2016/5/11/chartex" xmlns:cx6="http://schemas.microsoft.com/office/drawing/2016/5/12/chartex" xmlns:cx7="http://schemas.microsoft.com/office/drawing/2016/5/13/chartex" xmlns:cx8="http://schemas.microsoft.com/office/drawing/2016/5/14/chartex" xmlns:mc="http://schemas.openxmlformats.org/markup-compatibility/2006" xmlns:m="http://schemas.openxmlformats.org/officeDocument/2006/math" xmlns:aink="http://schemas.microsoft.com/office/drawing/2016/ink" xmlns:am3d="http://schemas.microsoft.com/office/drawing/2017/model3d" xmlns:oel="http://schemas.microsoft.com/office/2019/extlst" xmlns:r="http://schemas.openxmlformats.org/officeDocument/2006/relationships" xmlns:wp14="http://schemas.microsoft.com/office/word/2010/wordprocessingDrawing" xmlns:wp="http://schemas.openxmlformats.org/drawingml/2006/wordprocessingDrawing" xmlns:wpg="http://schemas.microsoft.com/office/word/2010/wordprocessingGroup" xmlns:wpi="http://schemas.microsoft.com/office/word/2010/wordprocessingInk" xmlns:wps="http://schemas.microsoft.com/office/word/2010/wordprocessingShape" xmlns:o="urn:schemas-microsoft-com:office:office" xmlns:v="urn:schemas-microsoft-com:vml" xmlns:w10="urn:schemas-microsoft-com:office:word" xmlns:w="http://schemas.openxmlformats.org/wordprocessingml/2006/main" xmlns:w14="http://schemas.microsoft.com/office/word/2010/wordml" xmlns:w15="http://schemas.microsoft.com/office/word/2012/wordml" xmlns:w16cex="http://schemas.microsoft.com/office/word/2018/wordml/cex" xmlns:w16cid="http://schemas.microsoft.com/office/word/2016/wordml/cid" xmlns:w16="http://schemas.microsoft.com/office/word/2018/wordml" xmlns:w16sdtdh="http://schemas.microsoft.com/office/word/2020/wordml/sdtdatahash" xmlns:w16sdtfl="http://schemas.microsoft.com/office/word/2024/wordml/sdtformatlock" xmlns:w16se="http://schemas.microsoft.com/office/word/2015/wordml/symex" xmlns:w16du="http://schemas.microsoft.com/office/word/2023/wordml/word16du" xmlns:wne="http://schemas.microsoft.com/office/word/2006/wordml" mc:Ignorable="w14 w15 w16se w16cid w16 w16cex w16sdtdh w16sdtfl w16du wp14">
   <w:body>
     <w:tbl>
       <w:tblPr>
@@ -58,11 +58,13 @@
               <w:ind w:leftChars="8" w:left="14"/>
               <w:jc w:val="both"/>
               <w:rPr>
+                <w:rFonts w:ascii="NanumGothic" w:hAnsi="NanumGothic"/>
                 <w:szCs w:val="20"/>
               </w:rPr>
             </w:pPr>
             <w:r>
               <w:rPr>
+                <w:rFonts w:ascii="NanumGothic" w:hAnsi="NanumGothic"/>
                 <w:b/>
                 <w:bCs/>
                 <w:szCs w:val="20"/>
@@ -71,6 +73,7 @@
             </w:r>
             <w:r>
               <w:rPr>
+                <w:rFonts w:ascii="NanumGothic" w:hAnsi="NanumGothic"/>
                 <w:szCs w:val="20"/>
               </w:rPr>
               <w:t xml:space="preserve"> </w:t>
@@ -79,6 +82,7 @@
               <w:r>
                 <w:rPr>
                   <w:rStyle w:val="ab"/>
+                  <w:rFonts w:ascii="NanumGothic" w:hAnsi="NanumGothic"/>
                   <w:szCs w:val="20"/>
                 </w:rPr>
                 <w:t>hyeonseungkang@outlook.com</w:t>
@@ -90,11 +94,13 @@
               <w:ind w:leftChars="8" w:left="14"/>
               <w:jc w:val="both"/>
               <w:rPr>
+                <w:rFonts w:ascii="NanumGothic" w:hAnsi="NanumGothic"/>
                 <w:szCs w:val="20"/>
               </w:rPr>
             </w:pPr>
             <w:r>
               <w:rPr>
+                <w:rFonts w:ascii="NanumGothic" w:hAnsi="NanumGothic"/>
                 <w:b/>
                 <w:bCs/>
                 <w:szCs w:val="20"/>
@@ -103,31 +109,35 @@
             </w:r>
             <w:r>
               <w:rPr>
+                <w:rFonts w:ascii="NanumGothic" w:hAnsi="NanumGothic"/>
                 <w:szCs w:val="20"/>
               </w:rPr>
               <w:t xml:space="preserve"> +8210</w:t>
             </w:r>
             <w:r>
               <w:rPr>
+                <w:rFonts w:ascii="NanumGothic" w:hAnsi="NanumGothic"/>
                 <w:szCs w:val="20"/>
               </w:rPr>
               <w:t>5934</w:t>
             </w:r>
             <w:r>
               <w:rPr>
+                <w:rFonts w:ascii="NanumGothic" w:hAnsi="NanumGothic"/>
                 <w:szCs w:val="20"/>
               </w:rPr>
               <w:t>055</w:t>
             </w:r>
             <w:r>
               <w:rPr>
+                <w:rFonts w:ascii="NanumGothic" w:hAnsi="NanumGothic"/>
                 <w:szCs w:val="20"/>
               </w:rPr>
               <w:t>2</w:t>
             </w:r>
             <w:r>
               <w:rPr>
-                <w:rFonts w:hint="eastAsia"/>
+                <w:rFonts w:ascii="NanumGothic" w:hAnsi="NanumGothic" w:hint="eastAsia"/>
                 <w:szCs w:val="20"/>
               </w:rPr>
               <w:t xml:space="preserve"> </w:t>
@@ -143,6 +153,7 @@
             </w:pPr>
             <w:r>
               <w:rPr>
+                <w:rFonts w:ascii="NanumGothic" w:hAnsi="NanumGothic"/>
                 <w:b/>
                 <w:bCs/>
                 <w:szCs w:val="20"/>
@@ -151,6 +162,7 @@
             </w:r>
             <w:r>
               <w:rPr>
+                <w:rFonts w:ascii="NanumGothic" w:hAnsi="NanumGothic"/>
                 <w:szCs w:val="20"/>
               </w:rPr>
               <w:t xml:space="preserve"> </w:t>
@@ -159,6 +171,7 @@
               <w:r>
                 <w:rPr>
                   <w:rStyle w:val="ab"/>
+                  <w:rFonts w:ascii="NanumGothic" w:hAnsi="NanumGothic"/>
                   <w:szCs w:val="20"/>
                 </w:rPr>
                 <w:t>https://hyeonseungkang.github.io</w:t>
@@ -166,6 +179,7 @@
             </w:hyperlink>
             <w:r>
               <w:rPr>
+                <w:rFonts w:ascii="NanumGothic" w:hAnsi="NanumGothic"/>
                 <w:szCs w:val="20"/>
               </w:rPr>
               <w:t xml:space="preserve"> </w:t>
@@ -195,6 +209,12 @@
           <w:insideH w:val="none" w:sz="0" w:space="0" w:color="auto"/>
           <w:insideV w:val="none" w:sz="0" w:space="0" w:color="auto"/>
         </w:tblBorders>
+        <w:tblCellMar>
+          <w:top w:w="57" w:type="dxa"/>
+          <w:left w:w="57" w:type="dxa"/>
+          <w:bottom w:w="57" w:type="dxa"/>
+          <w:right w:w="57" w:type="dxa"/>
+        </w:tblCellMar>
         <w:tblLook w:val="04A0" w:firstRow="1" w:lastRow="0" w:firstColumn="1" w:lastColumn="0" w:noHBand="0" w:noVBand="1"/>
       </w:tblPr>
       <w:tblGrid>
@@ -209,13 +229,13 @@
           <w:p>
             <w:pPr>
               <w:rPr>
-                <w:rFonts w:hint="eastAsia"/>
-                <w:szCs w:val="18"/>
-              </w:rPr>
-            </w:pPr>
-            <w:r>
-              <w:rPr>
-                <w:rFonts w:hint="eastAsia"/>
+                <w:rFonts w:ascii="NanumGothic" w:hAnsi="NanumGothic"/>
+                <w:szCs w:val="18"/>
+              </w:rPr>
+            </w:pPr>
+            <w:r>
+              <w:rPr>
+                <w:rFonts w:ascii="NanumGothic" w:hAnsi="NanumGothic" w:hint="eastAsia"/>
                 <w:szCs w:val="18"/>
               </w:rPr>
               <w:t xml:space="preserve">세븐일레븐수원탑동로점</w:t>
@@ -223,14 +243,15 @@
           </w:p>
           <w:p>
             <w:pPr>
-              <w:ind w:leftChars="400" w:left="720"/>
-              <w:rPr>
-                <w:szCs w:val="18"/>
-              </w:rPr>
-            </w:pPr>
-            <w:r>
-              <w:rPr>
-                <w:rFonts w:hint="eastAsia"/>
+              <w:ind w:leftChars="400" w:left="677"/>
+              <w:rPr>
+                <w:rFonts w:ascii="NanumGothic" w:hAnsi="NanumGothic"/>
+                <w:szCs w:val="18"/>
+              </w:rPr>
+            </w:pPr>
+            <w:r>
+              <w:rPr>
+                <w:rFonts w:ascii="NanumGothic" w:hAnsi="NanumGothic" w:hint="eastAsia"/>
                 <w:color w:val="595959" w:themeColor="text1" w:themeTint="A6"/>
                 <w:szCs w:val="18"/>
               </w:rPr>
@@ -245,19 +266,21 @@
           <w:p>
             <w:pPr>
               <w:rPr>
-                <w:szCs w:val="18"/>
-              </w:rPr>
-            </w:pPr>
-          </w:p>
-          <w:p>
-            <w:pPr>
-              <w:rPr>
-                <w:szCs w:val="18"/>
-              </w:rPr>
-            </w:pPr>
-            <w:r>
-              <w:rPr>
-                <w:rFonts w:hint="eastAsia"/>
+                <w:rFonts w:ascii="NanumGothic" w:hAnsi="NanumGothic"/>
+                <w:szCs w:val="18"/>
+              </w:rPr>
+            </w:pPr>
+          </w:p>
+          <w:p>
+            <w:pPr>
+              <w:rPr>
+                <w:rFonts w:ascii="NanumGothic" w:hAnsi="NanumGothic"/>
+                <w:szCs w:val="18"/>
+              </w:rPr>
+            </w:pPr>
+            <w:r>
+              <w:rPr>
+                <w:rFonts w:ascii="NanumGothic" w:hAnsi="NanumGothic" w:hint="eastAsia"/>
                 <w:szCs w:val="18"/>
               </w:rPr>
               <w:t xml:space="preserve">2025. 10. – 2026. 1. </w:t>
@@ -273,13 +296,13 @@
           <w:p>
             <w:pPr>
               <w:rPr>
-                <w:rFonts w:hint="eastAsia"/>
-                <w:szCs w:val="18"/>
-              </w:rPr>
-            </w:pPr>
-            <w:r>
-              <w:rPr>
-                <w:rFonts w:hint="eastAsia"/>
+                <w:rFonts w:ascii="NanumGothic" w:hAnsi="NanumGothic"/>
+                <w:szCs w:val="18"/>
+              </w:rPr>
+            </w:pPr>
+            <w:r>
+              <w:rPr>
+                <w:rFonts w:ascii="NanumGothic" w:hAnsi="NanumGothic" w:hint="eastAsia"/>
                 <w:szCs w:val="18"/>
               </w:rPr>
               <w:t xml:space="preserve">2026학년도 수원특례시 대학입시박람회</w:t>
@@ -287,14 +310,15 @@
           </w:p>
           <w:p>
             <w:pPr>
-              <w:ind w:leftChars="400" w:left="720"/>
-              <w:rPr>
-                <w:szCs w:val="18"/>
-              </w:rPr>
-            </w:pPr>
-            <w:r>
-              <w:rPr>
-                <w:rFonts w:hint="eastAsia"/>
+              <w:ind w:leftChars="400" w:left="677"/>
+              <w:rPr>
+                <w:rFonts w:ascii="NanumGothic" w:hAnsi="NanumGothic"/>
+                <w:szCs w:val="18"/>
+              </w:rPr>
+            </w:pPr>
+            <w:r>
+              <w:rPr>
+                <w:rFonts w:ascii="NanumGothic" w:hAnsi="NanumGothic" w:hint="eastAsia"/>
                 <w:color w:val="595959" w:themeColor="text1" w:themeTint="A6"/>
                 <w:szCs w:val="18"/>
               </w:rPr>
@@ -309,19 +333,21 @@
           <w:p>
             <w:pPr>
               <w:rPr>
-                <w:szCs w:val="18"/>
-              </w:rPr>
-            </w:pPr>
-          </w:p>
-          <w:p>
-            <w:pPr>
-              <w:rPr>
-                <w:szCs w:val="18"/>
-              </w:rPr>
-            </w:pPr>
-            <w:r>
-              <w:rPr>
-                <w:rFonts w:hint="eastAsia"/>
+                <w:rFonts w:ascii="NanumGothic" w:hAnsi="NanumGothic"/>
+                <w:szCs w:val="18"/>
+              </w:rPr>
+            </w:pPr>
+          </w:p>
+          <w:p>
+            <w:pPr>
+              <w:rPr>
+                <w:rFonts w:ascii="NanumGothic" w:hAnsi="NanumGothic"/>
+                <w:szCs w:val="18"/>
+              </w:rPr>
+            </w:pPr>
+            <w:r>
+              <w:rPr>
+                <w:rFonts w:ascii="NanumGothic" w:hAnsi="NanumGothic" w:hint="eastAsia"/>
                 <w:szCs w:val="18"/>
               </w:rPr>
               <w:t xml:space="preserve">2025. 8. – 2025. 8. </w:t>
@@ -337,13 +363,13 @@
           <w:p>
             <w:pPr>
               <w:rPr>
-                <w:rFonts w:hint="eastAsia"/>
-                <w:szCs w:val="18"/>
-              </w:rPr>
-            </w:pPr>
-            <w:r>
-              <w:rPr>
-                <w:rFonts w:hint="eastAsia"/>
+                <w:rFonts w:ascii="NanumGothic" w:hAnsi="NanumGothic"/>
+                <w:szCs w:val="18"/>
+              </w:rPr>
+            </w:pPr>
+            <w:r>
+              <w:rPr>
+                <w:rFonts w:ascii="NanumGothic" w:hAnsi="NanumGothic" w:hint="eastAsia"/>
                 <w:szCs w:val="18"/>
               </w:rPr>
               <w:t xml:space="preserve">GS25광교데시앙점</w:t>
@@ -351,14 +377,15 @@
           </w:p>
           <w:p>
             <w:pPr>
-              <w:ind w:leftChars="400" w:left="720"/>
-              <w:rPr>
-                <w:szCs w:val="18"/>
-              </w:rPr>
-            </w:pPr>
-            <w:r>
-              <w:rPr>
-                <w:rFonts w:hint="eastAsia"/>
+              <w:ind w:leftChars="400" w:left="677"/>
+              <w:rPr>
+                <w:rFonts w:ascii="NanumGothic" w:hAnsi="NanumGothic"/>
+                <w:szCs w:val="18"/>
+              </w:rPr>
+            </w:pPr>
+            <w:r>
+              <w:rPr>
+                <w:rFonts w:ascii="NanumGothic" w:hAnsi="NanumGothic" w:hint="eastAsia"/>
                 <w:color w:val="595959" w:themeColor="text1" w:themeTint="A6"/>
                 <w:szCs w:val="18"/>
               </w:rPr>
@@ -373,19 +400,21 @@
           <w:p>
             <w:pPr>
               <w:rPr>
-                <w:szCs w:val="18"/>
-              </w:rPr>
-            </w:pPr>
-          </w:p>
-          <w:p>
-            <w:pPr>
-              <w:rPr>
-                <w:szCs w:val="18"/>
-              </w:rPr>
-            </w:pPr>
-            <w:r>
-              <w:rPr>
-                <w:rFonts w:hint="eastAsia"/>
+                <w:rFonts w:ascii="NanumGothic" w:hAnsi="NanumGothic"/>
+                <w:szCs w:val="18"/>
+              </w:rPr>
+            </w:pPr>
+          </w:p>
+          <w:p>
+            <w:pPr>
+              <w:rPr>
+                <w:rFonts w:ascii="NanumGothic" w:hAnsi="NanumGothic"/>
+                <w:szCs w:val="18"/>
+              </w:rPr>
+            </w:pPr>
+            <w:r>
+              <w:rPr>
+                <w:rFonts w:ascii="NanumGothic" w:hAnsi="NanumGothic" w:hint="eastAsia"/>
                 <w:szCs w:val="18"/>
               </w:rPr>
               <w:t xml:space="preserve">2022. 9. – 2022. 12. </w:t>
@@ -418,6 +447,12 @@
           <w:insideH w:val="none" w:sz="0" w:space="0" w:color="auto"/>
           <w:insideV w:val="none" w:sz="0" w:space="0" w:color="auto"/>
         </w:tblBorders>
+        <w:tblCellMar>
+          <w:top w:w="57" w:type="dxa"/>
+          <w:left w:w="57" w:type="dxa"/>
+          <w:bottom w:w="57" w:type="dxa"/>
+          <w:right w:w="57" w:type="dxa"/>
+        </w:tblCellMar>
         <w:tblLook w:val="04A0" w:firstRow="1" w:lastRow="0" w:firstColumn="1" w:lastColumn="0" w:noHBand="0" w:noVBand="1"/>
       </w:tblPr>
       <w:tblGrid>
@@ -432,13 +467,13 @@
           <w:p>
             <w:pPr>
               <w:rPr>
-                <w:rFonts w:hint="eastAsia"/>
-                <w:szCs w:val="18"/>
-              </w:rPr>
-            </w:pPr>
-            <w:r>
-              <w:rPr>
-                <w:rFonts w:hint="eastAsia"/>
+                <w:rFonts w:ascii="NanumGothic" w:hAnsi="NanumGothic"/>
+                <w:szCs w:val="18"/>
+              </w:rPr>
+            </w:pPr>
+            <w:r>
+              <w:rPr>
+                <w:rFonts w:ascii="NanumGothic" w:hAnsi="NanumGothic" w:hint="eastAsia"/>
                 <w:szCs w:val="18"/>
               </w:rPr>
               <w:t xml:space="preserve">아주대학교 소학회 "B-cube(비큐브)"</w:t>
@@ -446,14 +481,15 @@
           </w:p>
           <w:p>
             <w:pPr>
-              <w:ind w:leftChars="400" w:left="720"/>
-              <w:rPr>
-                <w:szCs w:val="18"/>
-              </w:rPr>
-            </w:pPr>
-            <w:r>
-              <w:rPr>
-                <w:rFonts w:hint="eastAsia"/>
+              <w:ind w:leftChars="400" w:left="677"/>
+              <w:rPr>
+                <w:rFonts w:ascii="NanumGothic" w:hAnsi="NanumGothic"/>
+                <w:szCs w:val="18"/>
+              </w:rPr>
+            </w:pPr>
+            <w:r>
+              <w:rPr>
+                <w:rFonts w:ascii="NanumGothic" w:hAnsi="NanumGothic" w:hint="eastAsia"/>
                 <w:color w:val="595959" w:themeColor="text1" w:themeTint="A6"/>
                 <w:szCs w:val="18"/>
               </w:rPr>
@@ -468,19 +504,21 @@
           <w:p>
             <w:pPr>
               <w:rPr>
-                <w:szCs w:val="18"/>
-              </w:rPr>
-            </w:pPr>
-          </w:p>
-          <w:p>
-            <w:pPr>
-              <w:rPr>
-                <w:szCs w:val="18"/>
-              </w:rPr>
-            </w:pPr>
-            <w:r>
-              <w:rPr>
-                <w:rFonts w:hint="eastAsia"/>
+                <w:rFonts w:ascii="NanumGothic" w:hAnsi="NanumGothic"/>
+                <w:szCs w:val="18"/>
+              </w:rPr>
+            </w:pPr>
+          </w:p>
+          <w:p>
+            <w:pPr>
+              <w:rPr>
+                <w:rFonts w:ascii="NanumGothic" w:hAnsi="NanumGothic"/>
+                <w:szCs w:val="18"/>
+              </w:rPr>
+            </w:pPr>
+            <w:r>
+              <w:rPr>
+                <w:rFonts w:ascii="NanumGothic" w:hAnsi="NanumGothic" w:hint="eastAsia"/>
                 <w:szCs w:val="18"/>
               </w:rPr>
               <w:t xml:space="preserve">2026. 2. – 현재 </w:t>
@@ -496,13 +534,13 @@
           <w:p>
             <w:pPr>
               <w:rPr>
-                <w:rFonts w:hint="eastAsia"/>
-                <w:szCs w:val="18"/>
-              </w:rPr>
-            </w:pPr>
-            <w:r>
-              <w:rPr>
-                <w:rFonts w:hint="eastAsia"/>
+                <w:rFonts w:ascii="NanumGothic" w:hAnsi="NanumGothic"/>
+                <w:szCs w:val="18"/>
+              </w:rPr>
+            </w:pPr>
+            <w:r>
+              <w:rPr>
+                <w:rFonts w:ascii="NanumGothic" w:hAnsi="NanumGothic" w:hint="eastAsia"/>
                 <w:szCs w:val="18"/>
               </w:rPr>
               <w:t xml:space="preserve">아주대학교 인공지능융합학과</w:t>
@@ -510,14 +548,15 @@
           </w:p>
           <w:p>
             <w:pPr>
-              <w:ind w:leftChars="400" w:left="720"/>
-              <w:rPr>
-                <w:szCs w:val="18"/>
-              </w:rPr>
-            </w:pPr>
-            <w:r>
-              <w:rPr>
-                <w:rFonts w:hint="eastAsia"/>
+              <w:ind w:leftChars="400" w:left="677"/>
+              <w:rPr>
+                <w:rFonts w:ascii="NanumGothic" w:hAnsi="NanumGothic"/>
+                <w:szCs w:val="18"/>
+              </w:rPr>
+            </w:pPr>
+            <w:r>
+              <w:rPr>
+                <w:rFonts w:ascii="NanumGothic" w:hAnsi="NanumGothic" w:hint="eastAsia"/>
                 <w:color w:val="595959" w:themeColor="text1" w:themeTint="A6"/>
                 <w:szCs w:val="18"/>
               </w:rPr>
@@ -532,19 +571,21 @@
           <w:p>
             <w:pPr>
               <w:rPr>
-                <w:szCs w:val="18"/>
-              </w:rPr>
-            </w:pPr>
-          </w:p>
-          <w:p>
-            <w:pPr>
-              <w:rPr>
-                <w:szCs w:val="18"/>
-              </w:rPr>
-            </w:pPr>
-            <w:r>
-              <w:rPr>
-                <w:rFonts w:hint="eastAsia"/>
+                <w:rFonts w:ascii="NanumGothic" w:hAnsi="NanumGothic"/>
+                <w:szCs w:val="18"/>
+              </w:rPr>
+            </w:pPr>
+          </w:p>
+          <w:p>
+            <w:pPr>
+              <w:rPr>
+                <w:rFonts w:ascii="NanumGothic" w:hAnsi="NanumGothic"/>
+                <w:szCs w:val="18"/>
+              </w:rPr>
+            </w:pPr>
+            <w:r>
+              <w:rPr>
+                <w:rFonts w:ascii="NanumGothic" w:hAnsi="NanumGothic" w:hint="eastAsia"/>
                 <w:szCs w:val="18"/>
               </w:rPr>
               <w:t xml:space="preserve">2026. 2. – 2026. 6. </w:t>
@@ -560,13 +601,13 @@
           <w:p>
             <w:pPr>
               <w:rPr>
-                <w:rFonts w:hint="eastAsia"/>
-                <w:szCs w:val="18"/>
-              </w:rPr>
-            </w:pPr>
-            <w:r>
-              <w:rPr>
-                <w:rFonts w:hint="eastAsia"/>
+                <w:rFonts w:ascii="NanumGothic" w:hAnsi="NanumGothic"/>
+                <w:szCs w:val="18"/>
+              </w:rPr>
+            </w:pPr>
+            <w:r>
+              <w:rPr>
+                <w:rFonts w:ascii="NanumGothic" w:hAnsi="NanumGothic" w:hint="eastAsia"/>
                 <w:szCs w:val="18"/>
               </w:rPr>
               <w:t xml:space="preserve">아주대학교(경기) 중앙도서관 정보지원실</w:t>
@@ -574,14 +615,15 @@
           </w:p>
           <w:p>
             <w:pPr>
-              <w:ind w:leftChars="400" w:left="720"/>
-              <w:rPr>
-                <w:szCs w:val="18"/>
-              </w:rPr>
-            </w:pPr>
-            <w:r>
-              <w:rPr>
-                <w:rFonts w:hint="eastAsia"/>
+              <w:ind w:leftChars="400" w:left="677"/>
+              <w:rPr>
+                <w:rFonts w:ascii="NanumGothic" w:hAnsi="NanumGothic"/>
+                <w:szCs w:val="18"/>
+              </w:rPr>
+            </w:pPr>
+            <w:r>
+              <w:rPr>
+                <w:rFonts w:ascii="NanumGothic" w:hAnsi="NanumGothic" w:hint="eastAsia"/>
                 <w:color w:val="595959" w:themeColor="text1" w:themeTint="A6"/>
                 <w:szCs w:val="18"/>
               </w:rPr>
@@ -596,19 +638,21 @@
           <w:p>
             <w:pPr>
               <w:rPr>
-                <w:szCs w:val="18"/>
-              </w:rPr>
-            </w:pPr>
-          </w:p>
-          <w:p>
-            <w:pPr>
-              <w:rPr>
-                <w:szCs w:val="18"/>
-              </w:rPr>
-            </w:pPr>
-            <w:r>
-              <w:rPr>
-                <w:rFonts w:hint="eastAsia"/>
+                <w:rFonts w:ascii="NanumGothic" w:hAnsi="NanumGothic"/>
+                <w:szCs w:val="18"/>
+              </w:rPr>
+            </w:pPr>
+          </w:p>
+          <w:p>
+            <w:pPr>
+              <w:rPr>
+                <w:rFonts w:ascii="NanumGothic" w:hAnsi="NanumGothic"/>
+                <w:szCs w:val="18"/>
+              </w:rPr>
+            </w:pPr>
+            <w:r>
+              <w:rPr>
+                <w:rFonts w:ascii="NanumGothic" w:hAnsi="NanumGothic" w:hint="eastAsia"/>
                 <w:szCs w:val="18"/>
               </w:rPr>
               <w:t xml:space="preserve">2025. 3. – 2025. 8. </w:t>
@@ -624,13 +668,13 @@
           <w:p>
             <w:pPr>
               <w:rPr>
-                <w:rFonts w:hint="eastAsia"/>
-                <w:szCs w:val="18"/>
-              </w:rPr>
-            </w:pPr>
-            <w:r>
-              <w:rPr>
-                <w:rFonts w:hint="eastAsia"/>
+                <w:rFonts w:ascii="NanumGothic" w:hAnsi="NanumGothic"/>
+                <w:szCs w:val="18"/>
+              </w:rPr>
+            </w:pPr>
+            <w:r>
+              <w:rPr>
+                <w:rFonts w:ascii="NanumGothic" w:hAnsi="NanumGothic" w:hint="eastAsia"/>
                 <w:szCs w:val="18"/>
               </w:rPr>
               <w:t xml:space="preserve">육군 제5사단</w:t>
@@ -638,14 +682,15 @@
           </w:p>
           <w:p>
             <w:pPr>
-              <w:ind w:leftChars="400" w:left="720"/>
-              <w:rPr>
-                <w:szCs w:val="18"/>
-              </w:rPr>
-            </w:pPr>
-            <w:r>
-              <w:rPr>
-                <w:rFonts w:hint="eastAsia"/>
+              <w:ind w:leftChars="400" w:left="677"/>
+              <w:rPr>
+                <w:rFonts w:ascii="NanumGothic" w:hAnsi="NanumGothic"/>
+                <w:szCs w:val="18"/>
+              </w:rPr>
+            </w:pPr>
+            <w:r>
+              <w:rPr>
+                <w:rFonts w:ascii="NanumGothic" w:hAnsi="NanumGothic" w:hint="eastAsia"/>
                 <w:color w:val="595959" w:themeColor="text1" w:themeTint="A6"/>
                 <w:szCs w:val="18"/>
               </w:rPr>
@@ -660,19 +705,21 @@
           <w:p>
             <w:pPr>
               <w:rPr>
-                <w:szCs w:val="18"/>
-              </w:rPr>
-            </w:pPr>
-          </w:p>
-          <w:p>
-            <w:pPr>
-              <w:rPr>
-                <w:szCs w:val="18"/>
-              </w:rPr>
-            </w:pPr>
-            <w:r>
-              <w:rPr>
-                <w:rFonts w:hint="eastAsia"/>
+                <w:rFonts w:ascii="NanumGothic" w:hAnsi="NanumGothic"/>
+                <w:szCs w:val="18"/>
+              </w:rPr>
+            </w:pPr>
+          </w:p>
+          <w:p>
+            <w:pPr>
+              <w:rPr>
+                <w:rFonts w:ascii="NanumGothic" w:hAnsi="NanumGothic"/>
+                <w:szCs w:val="18"/>
+              </w:rPr>
+            </w:pPr>
+            <w:r>
+              <w:rPr>
+                <w:rFonts w:ascii="NanumGothic" w:hAnsi="NanumGothic" w:hint="eastAsia"/>
                 <w:szCs w:val="18"/>
               </w:rPr>
               <w:t xml:space="preserve">2023. 7. – 2025. 1. </w:t>
@@ -688,13 +735,13 @@
           <w:p>
             <w:pPr>
               <w:rPr>
-                <w:rFonts w:hint="eastAsia"/>
-                <w:szCs w:val="18"/>
-              </w:rPr>
-            </w:pPr>
-            <w:r>
-              <w:rPr>
-                <w:rFonts w:hint="eastAsia"/>
+                <w:rFonts w:ascii="NanumGothic" w:hAnsi="NanumGothic"/>
+                <w:szCs w:val="18"/>
+              </w:rPr>
+            </w:pPr>
+            <w:r>
+              <w:rPr>
+                <w:rFonts w:ascii="NanumGothic" w:hAnsi="NanumGothic" w:hint="eastAsia"/>
                 <w:szCs w:val="18"/>
               </w:rPr>
               <w:t xml:space="preserve">아주대학교(경기) 중앙도서관 정보지원실</w:t>
@@ -702,14 +749,15 @@
           </w:p>
           <w:p>
             <w:pPr>
-              <w:ind w:leftChars="400" w:left="720"/>
-              <w:rPr>
-                <w:szCs w:val="18"/>
-              </w:rPr>
-            </w:pPr>
-            <w:r>
-              <w:rPr>
-                <w:rFonts w:hint="eastAsia"/>
+              <w:ind w:leftChars="400" w:left="677"/>
+              <w:rPr>
+                <w:rFonts w:ascii="NanumGothic" w:hAnsi="NanumGothic"/>
+                <w:szCs w:val="18"/>
+              </w:rPr>
+            </w:pPr>
+            <w:r>
+              <w:rPr>
+                <w:rFonts w:ascii="NanumGothic" w:hAnsi="NanumGothic" w:hint="eastAsia"/>
                 <w:color w:val="595959" w:themeColor="text1" w:themeTint="A6"/>
                 <w:szCs w:val="18"/>
               </w:rPr>
@@ -724,19 +772,21 @@
           <w:p>
             <w:pPr>
               <w:rPr>
-                <w:szCs w:val="18"/>
-              </w:rPr>
-            </w:pPr>
-          </w:p>
-          <w:p>
-            <w:pPr>
-              <w:rPr>
-                <w:szCs w:val="18"/>
-              </w:rPr>
-            </w:pPr>
-            <w:r>
-              <w:rPr>
-                <w:rFonts w:hint="eastAsia"/>
+                <w:rFonts w:ascii="NanumGothic" w:hAnsi="NanumGothic"/>
+                <w:szCs w:val="18"/>
+              </w:rPr>
+            </w:pPr>
+          </w:p>
+          <w:p>
+            <w:pPr>
+              <w:rPr>
+                <w:rFonts w:ascii="NanumGothic" w:hAnsi="NanumGothic"/>
+                <w:szCs w:val="18"/>
+              </w:rPr>
+            </w:pPr>
+            <w:r>
+              <w:rPr>
+                <w:rFonts w:ascii="NanumGothic" w:hAnsi="NanumGothic" w:hint="eastAsia"/>
                 <w:szCs w:val="18"/>
               </w:rPr>
               <w:t xml:space="preserve">2023. 1. – 2023. 6. </w:t>
@@ -769,6 +819,12 @@
           <w:insideH w:val="none" w:sz="0" w:space="0" w:color="auto"/>
           <w:insideV w:val="none" w:sz="0" w:space="0" w:color="auto"/>
         </w:tblBorders>
+        <w:tblCellMar>
+          <w:top w:w="57" w:type="dxa"/>
+          <w:left w:w="57" w:type="dxa"/>
+          <w:bottom w:w="57" w:type="dxa"/>
+          <w:right w:w="57" w:type="dxa"/>
+        </w:tblCellMar>
         <w:tblLook w:val="04A0" w:firstRow="1" w:lastRow="0" w:firstColumn="1" w:lastColumn="0" w:noHBand="0" w:noVBand="1"/>
       </w:tblPr>
       <w:tblGrid>
@@ -784,13 +840,13 @@
           <w:p>
             <w:pPr>
               <w:rPr>
-                <w:rFonts w:hint="eastAsia"/>
-                <w:szCs w:val="18"/>
-              </w:rPr>
-            </w:pPr>
-            <w:r>
-              <w:rPr>
-                <w:rFonts w:hint="eastAsia"/>
+                <w:rFonts w:ascii="NanumGothic" w:hAnsi="NanumGothic"/>
+                <w:szCs w:val="18"/>
+              </w:rPr>
+            </w:pPr>
+            <w:r>
+              <w:rPr>
+                <w:rFonts w:ascii="NanumGothic" w:hAnsi="NanumGothic" w:hint="eastAsia"/>
                 <w:szCs w:val="18"/>
               </w:rPr>
               <w:t xml:space="preserve">SQL 개발자(SQLD)</w:t>
@@ -804,12 +860,13 @@
           <w:p>
             <w:pPr>
               <w:rPr>
-                <w:szCs w:val="18"/>
-              </w:rPr>
-            </w:pPr>
-            <w:r>
-              <w:rPr>
-                <w:rFonts w:hint="eastAsia"/>
+                <w:rFonts w:ascii="NanumGothic" w:hAnsi="NanumGothic"/>
+                <w:szCs w:val="18"/>
+              </w:rPr>
+            </w:pPr>
+            <w:r>
+              <w:rPr>
+                <w:rFonts w:ascii="NanumGothic" w:hAnsi="NanumGothic" w:hint="eastAsia"/>
                 <w:szCs w:val="18"/>
               </w:rPr>
               <w:t xml:space="preserve"/>
@@ -823,13 +880,13 @@
           <w:p>
             <w:pPr>
               <w:rPr>
-                <w:rFonts w:hint="eastAsia"/>
-                <w:szCs w:val="18"/>
-              </w:rPr>
-            </w:pPr>
-            <w:r>
-              <w:rPr>
-                <w:rFonts w:hint="eastAsia"/>
+                <w:rFonts w:ascii="NanumGothic" w:hAnsi="NanumGothic"/>
+                <w:szCs w:val="18"/>
+              </w:rPr>
+            </w:pPr>
+            <w:r>
+              <w:rPr>
+                <w:rFonts w:ascii="NanumGothic" w:hAnsi="NanumGothic" w:hint="eastAsia"/>
                 <w:szCs w:val="18"/>
               </w:rPr>
               <w:t xml:space="preserve">2025. 12. 12.</w:t>
@@ -845,13 +902,13 @@
           <w:p>
             <w:pPr>
               <w:rPr>
-                <w:rFonts w:hint="eastAsia"/>
-                <w:szCs w:val="18"/>
-              </w:rPr>
-            </w:pPr>
-            <w:r>
-              <w:rPr>
-                <w:rFonts w:hint="eastAsia"/>
+                <w:rFonts w:ascii="NanumGothic" w:hAnsi="NanumGothic"/>
+                <w:szCs w:val="18"/>
+              </w:rPr>
+            </w:pPr>
+            <w:r>
+              <w:rPr>
+                <w:rFonts w:ascii="NanumGothic" w:hAnsi="NanumGothic" w:hint="eastAsia"/>
                 <w:szCs w:val="18"/>
               </w:rPr>
               <w:t xml:space="preserve">데이터 분석 준전문가(ADsP)</w:t>
@@ -865,12 +922,13 @@
           <w:p>
             <w:pPr>
               <w:rPr>
-                <w:szCs w:val="18"/>
-              </w:rPr>
-            </w:pPr>
-            <w:r>
-              <w:rPr>
-                <w:rFonts w:hint="eastAsia"/>
+                <w:rFonts w:ascii="NanumGothic" w:hAnsi="NanumGothic"/>
+                <w:szCs w:val="18"/>
+              </w:rPr>
+            </w:pPr>
+            <w:r>
+              <w:rPr>
+                <w:rFonts w:ascii="NanumGothic" w:hAnsi="NanumGothic" w:hint="eastAsia"/>
                 <w:szCs w:val="18"/>
               </w:rPr>
               <w:t xml:space="preserve"/>
@@ -884,13 +942,13 @@
           <w:p>
             <w:pPr>
               <w:rPr>
-                <w:rFonts w:hint="eastAsia"/>
-                <w:szCs w:val="18"/>
-              </w:rPr>
-            </w:pPr>
-            <w:r>
-              <w:rPr>
-                <w:rFonts w:hint="eastAsia"/>
+                <w:rFonts w:ascii="NanumGothic" w:hAnsi="NanumGothic"/>
+                <w:szCs w:val="18"/>
+              </w:rPr>
+            </w:pPr>
+            <w:r>
+              <w:rPr>
+                <w:rFonts w:ascii="NanumGothic" w:hAnsi="NanumGothic" w:hint="eastAsia"/>
                 <w:szCs w:val="18"/>
               </w:rPr>
               <w:t xml:space="preserve">2025. 9. 5.</w:t>
@@ -906,13 +964,13 @@
           <w:p>
             <w:pPr>
               <w:rPr>
-                <w:rFonts w:hint="eastAsia"/>
-                <w:szCs w:val="18"/>
-              </w:rPr>
-            </w:pPr>
-            <w:r>
-              <w:rPr>
-                <w:rFonts w:hint="eastAsia"/>
+                <w:rFonts w:ascii="NanumGothic" w:hAnsi="NanumGothic"/>
+                <w:szCs w:val="18"/>
+              </w:rPr>
+            </w:pPr>
+            <w:r>
+              <w:rPr>
+                <w:rFonts w:ascii="NanumGothic" w:hAnsi="NanumGothic" w:hint="eastAsia"/>
                 <w:szCs w:val="18"/>
               </w:rPr>
               <w:t xml:space="preserve">운전 면허</w:t>
@@ -926,12 +984,13 @@
           <w:p>
             <w:pPr>
               <w:rPr>
-                <w:szCs w:val="18"/>
-              </w:rPr>
-            </w:pPr>
-            <w:r>
-              <w:rPr>
-                <w:rFonts w:hint="eastAsia"/>
+                <w:rFonts w:ascii="NanumGothic" w:hAnsi="NanumGothic"/>
+                <w:szCs w:val="18"/>
+              </w:rPr>
+            </w:pPr>
+            <w:r>
+              <w:rPr>
+                <w:rFonts w:ascii="NanumGothic" w:hAnsi="NanumGothic" w:hint="eastAsia"/>
                 <w:szCs w:val="18"/>
               </w:rPr>
               <w:t xml:space="preserve">1종 보통</w:t>
@@ -945,13 +1004,13 @@
           <w:p>
             <w:pPr>
               <w:rPr>
-                <w:rFonts w:hint="eastAsia"/>
-                <w:szCs w:val="18"/>
-              </w:rPr>
-            </w:pPr>
-            <w:r>
-              <w:rPr>
-                <w:rFonts w:hint="eastAsia"/>
+                <w:rFonts w:ascii="NanumGothic" w:hAnsi="NanumGothic"/>
+                <w:szCs w:val="18"/>
+              </w:rPr>
+            </w:pPr>
+            <w:r>
+              <w:rPr>
+                <w:rFonts w:ascii="NanumGothic" w:hAnsi="NanumGothic" w:hint="eastAsia"/>
                 <w:szCs w:val="18"/>
               </w:rPr>
               <w:t xml:space="preserve">2022. 7. 29.</w:t>
@@ -967,13 +1026,13 @@
           <w:p>
             <w:pPr>
               <w:rPr>
-                <w:rFonts w:hint="eastAsia"/>
-                <w:szCs w:val="18"/>
-              </w:rPr>
-            </w:pPr>
-            <w:r>
-              <w:rPr>
-                <w:rFonts w:hint="eastAsia"/>
+                <w:rFonts w:ascii="NanumGothic" w:hAnsi="NanumGothic"/>
+                <w:szCs w:val="18"/>
+              </w:rPr>
+            </w:pPr>
+            <w:r>
+              <w:rPr>
+                <w:rFonts w:ascii="NanumGothic" w:hAnsi="NanumGothic" w:hint="eastAsia"/>
                 <w:szCs w:val="18"/>
               </w:rPr>
               <w:t xml:space="preserve">TOEIC(토익)</w:t>
@@ -987,12 +1046,13 @@
           <w:p>
             <w:pPr>
               <w:rPr>
-                <w:szCs w:val="18"/>
-              </w:rPr>
-            </w:pPr>
-            <w:r>
-              <w:rPr>
-                <w:rFonts w:hint="eastAsia"/>
+                <w:rFonts w:ascii="NanumGothic" w:hAnsi="NanumGothic"/>
+                <w:szCs w:val="18"/>
+              </w:rPr>
+            </w:pPr>
+            <w:r>
+              <w:rPr>
+                <w:rFonts w:ascii="NanumGothic" w:hAnsi="NanumGothic" w:hint="eastAsia"/>
                 <w:szCs w:val="18"/>
               </w:rPr>
               <w:t xml:space="preserve">870점</w:t>
@@ -1006,13 +1066,13 @@
           <w:p>
             <w:pPr>
               <w:rPr>
-                <w:rFonts w:hint="eastAsia"/>
-                <w:szCs w:val="18"/>
-              </w:rPr>
-            </w:pPr>
-            <w:r>
-              <w:rPr>
-                <w:rFonts w:hint="eastAsia"/>
+                <w:rFonts w:ascii="NanumGothic" w:hAnsi="NanumGothic"/>
+                <w:szCs w:val="18"/>
+              </w:rPr>
+            </w:pPr>
+            <w:r>
+              <w:rPr>
+                <w:rFonts w:ascii="NanumGothic" w:hAnsi="NanumGothic" w:hint="eastAsia"/>
                 <w:szCs w:val="18"/>
               </w:rPr>
               <w:t xml:space="preserve">2026. 3. 24.</w:t>
@@ -1028,13 +1088,13 @@
           <w:p>
             <w:pPr>
               <w:rPr>
-                <w:rFonts w:hint="eastAsia"/>
-                <w:szCs w:val="18"/>
-              </w:rPr>
-            </w:pPr>
-            <w:r>
-              <w:rPr>
-                <w:rFonts w:hint="eastAsia"/>
+                <w:rFonts w:ascii="NanumGothic" w:hAnsi="NanumGothic"/>
+                <w:szCs w:val="18"/>
+              </w:rPr>
+            </w:pPr>
+            <w:r>
+              <w:rPr>
+                <w:rFonts w:ascii="NanumGothic" w:hAnsi="NanumGothic" w:hint="eastAsia"/>
                 <w:szCs w:val="18"/>
               </w:rPr>
               <w:t xml:space="preserve">컴퓨터활용능력</w:t>
@@ -1048,12 +1108,13 @@
           <w:p>
             <w:pPr>
               <w:rPr>
-                <w:szCs w:val="18"/>
-              </w:rPr>
-            </w:pPr>
-            <w:r>
-              <w:rPr>
-                <w:rFonts w:hint="eastAsia"/>
+                <w:rFonts w:ascii="NanumGothic" w:hAnsi="NanumGothic"/>
+                <w:szCs w:val="18"/>
+              </w:rPr>
+            </w:pPr>
+            <w:r>
+              <w:rPr>
+                <w:rFonts w:ascii="NanumGothic" w:hAnsi="NanumGothic" w:hint="eastAsia"/>
                 <w:szCs w:val="18"/>
               </w:rPr>
               <w:t xml:space="preserve">2급</w:t>
@@ -1067,13 +1128,13 @@
           <w:p>
             <w:pPr>
               <w:rPr>
-                <w:rFonts w:hint="eastAsia"/>
-                <w:szCs w:val="18"/>
-              </w:rPr>
-            </w:pPr>
-            <w:r>
-              <w:rPr>
-                <w:rFonts w:hint="eastAsia"/>
+                <w:rFonts w:ascii="NanumGothic" w:hAnsi="NanumGothic"/>
+                <w:szCs w:val="18"/>
+              </w:rPr>
+            </w:pPr>
+            <w:r>
+              <w:rPr>
+                <w:rFonts w:ascii="NanumGothic" w:hAnsi="NanumGothic" w:hint="eastAsia"/>
                 <w:szCs w:val="18"/>
               </w:rPr>
               <w:t xml:space="preserve">2026. 3. 3.</w:t>
@@ -1089,13 +1150,13 @@
           <w:p>
             <w:pPr>
               <w:rPr>
-                <w:rFonts w:hint="eastAsia"/>
-                <w:szCs w:val="18"/>
-              </w:rPr>
-            </w:pPr>
-            <w:r>
-              <w:rPr>
-                <w:rFonts w:hint="eastAsia"/>
+                <w:rFonts w:ascii="NanumGothic" w:hAnsi="NanumGothic"/>
+                <w:szCs w:val="18"/>
+              </w:rPr>
+            </w:pPr>
+            <w:r>
+              <w:rPr>
+                <w:rFonts w:ascii="NanumGothic" w:hAnsi="NanumGothic" w:hint="eastAsia"/>
                 <w:szCs w:val="18"/>
               </w:rPr>
               <w:t xml:space="preserve">OPIc(오픽)</w:t>
@@ -1109,12 +1170,13 @@
           <w:p>
             <w:pPr>
               <w:rPr>
-                <w:szCs w:val="18"/>
-              </w:rPr>
-            </w:pPr>
-            <w:r>
-              <w:rPr>
-                <w:rFonts w:hint="eastAsia"/>
+                <w:rFonts w:ascii="NanumGothic" w:hAnsi="NanumGothic"/>
+                <w:szCs w:val="18"/>
+              </w:rPr>
+            </w:pPr>
+            <w:r>
+              <w:rPr>
+                <w:rFonts w:ascii="NanumGothic" w:hAnsi="NanumGothic" w:hint="eastAsia"/>
                 <w:szCs w:val="18"/>
               </w:rPr>
               <w:t xml:space="preserve">IM2</w:t>
@@ -1128,13 +1190,13 @@
           <w:p>
             <w:pPr>
               <w:rPr>
-                <w:rFonts w:hint="eastAsia"/>
-                <w:szCs w:val="18"/>
-              </w:rPr>
-            </w:pPr>
-            <w:r>
-              <w:rPr>
-                <w:rFonts w:hint="eastAsia"/>
+                <w:rFonts w:ascii="NanumGothic" w:hAnsi="NanumGothic"/>
+                <w:szCs w:val="18"/>
+              </w:rPr>
+            </w:pPr>
+            <w:r>
+              <w:rPr>
+                <w:rFonts w:ascii="NanumGothic" w:hAnsi="NanumGothic" w:hint="eastAsia"/>
                 <w:szCs w:val="18"/>
               </w:rPr>
               <w:t xml:space="preserve">2026. 2. 28.</w:t>
@@ -1155,7 +1217,7 @@
 </file>
 
 <file path=word/numbering.xml><?xml version="1.0" encoding="utf-8"?>
-<w:numbering xmlns:wpc="http://schemas.microsoft.com/office/word/2010/wordprocessingCanvas" xmlns:cx="http://schemas.microsoft.com/office/drawing/2014/chartex" xmlns:cx1="http://schemas.microsoft.com/office/drawing/2015/9/8/chartex" xmlns:cx2="http://schemas.microsoft.com/office/drawing/2015/10/21/chartex" xmlns:cx3="http://schemas.microsoft.com/office/drawing/2016/5/9/chartex" xmlns:cx4="http://schemas.microsoft.com/office/drawing/2016/5/10/chartex" xmlns:cx5="http://schemas.microsoft.com/office/drawing/2016/5/11/chartex" xmlns:cx6="http://schemas.microsoft.com/office/drawing/2016/5/12/chartex" xmlns:cx7="http://schemas.microsoft.com/office/drawing/2016/5/13/chartex" xmlns:cx8="http://schemas.microsoft.com/office/drawing/2016/5/14/chartex" xmlns:mc="http://schemas.openxmlformats.org/markup-compatibility/2006" xmlns:m="http://schemas.openxmlformats.org/officeDocument/2006/math" xmlns:aink="http://schemas.microsoft.com/office/drawing/2016/ink" xmlns:am3d="http://schemas.microsoft.com/office/drawing/2017/model3d" xmlns:oel="http://schemas.microsoft.com/office/2019/extlst" xmlns:r="http://schemas.openxmlformats.org/officeDocument/2006/relationships" xmlns:wp14="http://schemas.microsoft.com/office/word/2010/wordprocessingDrawing" xmlns:wp="http://schemas.openxmlformats.org/drawingml/2006/wordprocessingDrawing" xmlns:wpg="http://schemas.microsoft.com/office/word/2010/wordprocessingGroup" xmlns:wpi="http://schemas.microsoft.com/office/word/2010/wordprocessingInk" xmlns:wps="http://schemas.microsoft.com/office/word/2010/wordprocessingShape" xmlns:o="urn:schemas-microsoft-com:office:office" xmlns:v="urn:schemas-microsoft-com:vml" xmlns:w10="urn:schemas-microsoft-com:office:word" xmlns:w="http://schemas.openxmlformats.org/wordprocessingml/2006/main" xmlns:w14="http://schemas.microsoft.com/office/word/2010/wordml" xmlns:w15="http://schemas.microsoft.com/office/word/2012/wordml" xmlns:w16cei="http://schemas.microsoft.com/office/word/2026/wordml/cei" xmlns:w16cex="http://schemas.microsoft.com/office/word/2018/wordml/cex" xmlns:w16cid="http://schemas.microsoft.com/office/word/2016/wordml/cid" xmlns:w16="http://schemas.microsoft.com/office/word/2018/wordml" xmlns:w16sdtdh="http://schemas.microsoft.com/office/word/2020/wordml/sdtdatahash" xmlns:w16sdtfl="http://schemas.microsoft.com/office/word/2024/wordml/sdtformatlock" xmlns:w16se="http://schemas.microsoft.com/office/word/2015/wordml/symex" xmlns:w16du="http://schemas.microsoft.com/office/word/2023/wordml/word16du" xmlns:wne="http://schemas.microsoft.com/office/word/2006/wordml" mc:Ignorable="w14 w15 w16se w16cid w16 w16cex w16sdtdh w16sdtfl w16du wp14">
+<w:numbering xmlns:wpc="http://schemas.microsoft.com/office/word/2010/wordprocessingCanvas" xmlns:cx="http://schemas.microsoft.com/office/drawing/2014/chartex" xmlns:cx1="http://schemas.microsoft.com/office/drawing/2015/9/8/chartex" xmlns:cx2="http://schemas.microsoft.com/office/drawing/2015/10/21/chartex" xmlns:cx3="http://schemas.microsoft.com/office/drawing/2016/5/9/chartex" xmlns:cx4="http://schemas.microsoft.com/office/drawing/2016/5/10/chartex" xmlns:cx5="http://schemas.microsoft.com/office/drawing/2016/5/11/chartex" xmlns:cx6="http://schemas.microsoft.com/office/drawing/2016/5/12/chartex" xmlns:cx7="http://schemas.microsoft.com/office/drawing/2016/5/13/chartex" xmlns:cx8="http://schemas.microsoft.com/office/drawing/2016/5/14/chartex" xmlns:mc="http://schemas.openxmlformats.org/markup-compatibility/2006" xmlns:m="http://schemas.openxmlformats.org/officeDocument/2006/math" xmlns:aink="http://schemas.microsoft.com/office/drawing/2016/ink" xmlns:am3d="http://schemas.microsoft.com/office/drawing/2017/model3d" xmlns:oel="http://schemas.microsoft.com/office/2019/extlst" xmlns:r="http://schemas.openxmlformats.org/officeDocument/2006/relationships" xmlns:wp14="http://schemas.microsoft.com/office/word/2010/wordprocessingDrawing" xmlns:wp="http://schemas.openxmlformats.org/drawingml/2006/wordprocessingDrawing" xmlns:wpg="http://schemas.microsoft.com/office/word/2010/wordprocessingGroup" xmlns:wpi="http://schemas.microsoft.com/office/word/2010/wordprocessingInk" xmlns:wps="http://schemas.microsoft.com/office/word/2010/wordprocessingShape" xmlns:o="urn:schemas-microsoft-com:office:office" xmlns:v="urn:schemas-microsoft-com:vml" xmlns:w10="urn:schemas-microsoft-com:office:word" xmlns:w="http://schemas.openxmlformats.org/wordprocessingml/2006/main" xmlns:w14="http://schemas.microsoft.com/office/word/2010/wordml" xmlns:w15="http://schemas.microsoft.com/office/word/2012/wordml" xmlns:w16cex="http://schemas.microsoft.com/office/word/2018/wordml/cex" xmlns:w16cid="http://schemas.microsoft.com/office/word/2016/wordml/cid" xmlns:w16="http://schemas.microsoft.com/office/word/2018/wordml" xmlns:w16sdtdh="http://schemas.microsoft.com/office/word/2020/wordml/sdtdatahash" xmlns:w16sdtfl="http://schemas.microsoft.com/office/word/2024/wordml/sdtformatlock" xmlns:w16se="http://schemas.microsoft.com/office/word/2015/wordml/symex" xmlns:w16du="http://schemas.microsoft.com/office/word/2023/wordml/word16du" xmlns:wne="http://schemas.microsoft.com/office/word/2006/wordml" mc:Ignorable="w14 w15 w16se w16cid w16 w16cex w16sdtdh w16sdtfl w16du wp14">
   <w:abstractNum w:abstractNumId="0" w15:restartNumberingAfterBreak="0">
     <w:nsid w:val="7D7F475E"/>
     <w:multiLevelType w:val="hybridMultilevel"/>
@@ -1650,7 +1712,7 @@
   <w:style w:type="paragraph" w:default="1" w:styleId="a">
     <w:name w:val="Normal"/>
     <w:qFormat/>
-    <w:rsid w:val="005057FC"/>
+    <w:rsid w:val="00D23F78"/>
     <w:pPr>
       <w:widowControl w:val="0"/>
       <w:wordWrap w:val="0"/>
@@ -1659,6 +1721,7 @@
       <w:spacing w:line="288" w:lineRule="auto"/>
     </w:pPr>
     <w:rPr>
+      <w:rFonts w:eastAsia="NanumGothic"/>
       <w:sz w:val="18"/>
     </w:rPr>
   </w:style>

</xml_diff>